<commit_message>
Master: update with new test on 13-10
</commit_message>
<xml_diff>
--- a/Assembly/Assembly_dosBox/doc_lezioni/Laboratorio_Assembly_8086.docx
+++ b/Assembly/Assembly_dosBox/doc_lezioni/Laboratorio_Assembly_8086.docx
@@ -6,6 +6,9 @@
       <w:pPr>
         <w:spacing w:before="800"/>
       </w:pPr>
+      <w:r>
+        <w:t>,</w:t>
+      </w:r>
     </w:p>
     <w:p>
       <w:pPr>
@@ -7406,6 +7409,444 @@
             <w:pPr>
               <w:spacing w:before="20" w:after="20"/>
               <w:ind w:left="708" w:hanging="708"/>
+            </w:pPr>
+            <w:r>
+              <w:rPr>
+                <w:rFonts w:ascii="Courier New" w:eastAsia="Courier New" w:hAnsi="Courier New" w:cs="Courier New"/>
+                <w:color w:val="D4D4D4"/>
+                <w:sz w:val="18"/>
+                <w:szCs w:val="18"/>
+              </w:rPr>
+              <w:t xml:space="preserve">MOV AX, 0005h   </w:t>
+            </w:r>
+            <w:proofErr w:type="gramStart"/>
+            <w:r>
+              <w:rPr>
+                <w:rFonts w:ascii="Courier New" w:eastAsia="Courier New" w:hAnsi="Courier New" w:cs="Courier New"/>
+                <w:color w:val="D4D4D4"/>
+                <w:sz w:val="18"/>
+                <w:szCs w:val="18"/>
+              </w:rPr>
+              <w:t xml:space="preserve">  ;</w:t>
+            </w:r>
+            <w:proofErr w:type="gramEnd"/>
+            <w:r>
+              <w:rPr>
+                <w:rFonts w:ascii="Courier New" w:eastAsia="Courier New" w:hAnsi="Courier New" w:cs="Courier New"/>
+                <w:color w:val="D4D4D4"/>
+                <w:sz w:val="18"/>
+                <w:szCs w:val="18"/>
+              </w:rPr>
+              <w:t xml:space="preserve"> AX = 5</w:t>
+            </w:r>
+          </w:p>
+          <w:p>
+            <w:pPr>
+              <w:spacing w:before="20" w:after="20"/>
+              <w:ind w:left="708" w:hanging="708"/>
+            </w:pPr>
+            <w:r>
+              <w:rPr>
+                <w:rFonts w:ascii="Courier New" w:eastAsia="Courier New" w:hAnsi="Courier New" w:cs="Courier New"/>
+                <w:color w:val="D4D4D4"/>
+                <w:sz w:val="18"/>
+                <w:szCs w:val="18"/>
+              </w:rPr>
+              <w:t xml:space="preserve">MOV BX, 0003h   </w:t>
+            </w:r>
+            <w:proofErr w:type="gramStart"/>
+            <w:r>
+              <w:rPr>
+                <w:rFonts w:ascii="Courier New" w:eastAsia="Courier New" w:hAnsi="Courier New" w:cs="Courier New"/>
+                <w:color w:val="D4D4D4"/>
+                <w:sz w:val="18"/>
+                <w:szCs w:val="18"/>
+              </w:rPr>
+              <w:t xml:space="preserve">  ;</w:t>
+            </w:r>
+            <w:proofErr w:type="gramEnd"/>
+            <w:r>
+              <w:rPr>
+                <w:rFonts w:ascii="Courier New" w:eastAsia="Courier New" w:hAnsi="Courier New" w:cs="Courier New"/>
+                <w:color w:val="D4D4D4"/>
+                <w:sz w:val="18"/>
+                <w:szCs w:val="18"/>
+              </w:rPr>
+              <w:t xml:space="preserve"> BX = 3</w:t>
+            </w:r>
+          </w:p>
+          <w:p>
+            <w:pPr>
+              <w:spacing w:before="20" w:after="20"/>
+              <w:ind w:left="708" w:hanging="708"/>
+            </w:pPr>
+            <w:r>
+              <w:rPr>
+                <w:rFonts w:ascii="Courier New" w:eastAsia="Courier New" w:hAnsi="Courier New" w:cs="Courier New"/>
+                <w:color w:val="D4D4D4"/>
+                <w:sz w:val="18"/>
+                <w:szCs w:val="18"/>
+              </w:rPr>
+              <w:t xml:space="preserve">ADD AX, BX      </w:t>
+            </w:r>
+            <w:proofErr w:type="gramStart"/>
+            <w:r>
+              <w:rPr>
+                <w:rFonts w:ascii="Courier New" w:eastAsia="Courier New" w:hAnsi="Courier New" w:cs="Courier New"/>
+                <w:color w:val="D4D4D4"/>
+                <w:sz w:val="18"/>
+                <w:szCs w:val="18"/>
+              </w:rPr>
+              <w:t xml:space="preserve">  ;</w:t>
+            </w:r>
+            <w:proofErr w:type="gramEnd"/>
+            <w:r>
+              <w:rPr>
+                <w:rFonts w:ascii="Courier New" w:eastAsia="Courier New" w:hAnsi="Courier New" w:cs="Courier New"/>
+                <w:color w:val="D4D4D4"/>
+                <w:sz w:val="18"/>
+                <w:szCs w:val="18"/>
+              </w:rPr>
+              <w:t xml:space="preserve"> AX = AX + BX = </w:t>
+            </w:r>
+            <w:proofErr w:type="gramStart"/>
+            <w:r>
+              <w:rPr>
+                <w:rFonts w:ascii="Courier New" w:eastAsia="Courier New" w:hAnsi="Courier New" w:cs="Courier New"/>
+                <w:color w:val="D4D4D4"/>
+                <w:sz w:val="18"/>
+                <w:szCs w:val="18"/>
+              </w:rPr>
+              <w:t>8  →</w:t>
+            </w:r>
+            <w:proofErr w:type="gramEnd"/>
+            <w:r>
+              <w:rPr>
+                <w:rFonts w:ascii="Courier New" w:eastAsia="Courier New" w:hAnsi="Courier New" w:cs="Courier New"/>
+                <w:color w:val="D4D4D4"/>
+                <w:sz w:val="18"/>
+                <w:szCs w:val="18"/>
+              </w:rPr>
+              <w:t xml:space="preserve">  ZF=0, CF=0, SF=0</w:t>
+            </w:r>
+          </w:p>
+          <w:p>
+            <w:pPr>
+              <w:spacing w:before="20" w:after="20"/>
+            </w:pPr>
+          </w:p>
+          <w:p>
+            <w:pPr>
+              <w:spacing w:before="20" w:after="20"/>
+            </w:pPr>
+            <w:r>
+              <w:rPr>
+                <w:rFonts w:ascii="Courier New" w:eastAsia="Courier New" w:hAnsi="Courier New" w:cs="Courier New"/>
+                <w:color w:val="D4D4D4"/>
+                <w:sz w:val="18"/>
+                <w:szCs w:val="18"/>
+              </w:rPr>
+              <w:t>; SUB – sottrazione</w:t>
+            </w:r>
+          </w:p>
+          <w:p>
+            <w:pPr>
+              <w:spacing w:before="20" w:after="20"/>
+            </w:pPr>
+            <w:r>
+              <w:rPr>
+                <w:rFonts w:ascii="Courier New" w:eastAsia="Courier New" w:hAnsi="Courier New" w:cs="Courier New"/>
+                <w:color w:val="D4D4D4"/>
+                <w:sz w:val="18"/>
+                <w:szCs w:val="18"/>
+              </w:rPr>
+              <w:t>MOV AX, 0005h</w:t>
+            </w:r>
+          </w:p>
+          <w:p>
+            <w:pPr>
+              <w:spacing w:before="20" w:after="20"/>
+            </w:pPr>
+            <w:r>
+              <w:rPr>
+                <w:rFonts w:ascii="Courier New" w:eastAsia="Courier New" w:hAnsi="Courier New" w:cs="Courier New"/>
+                <w:color w:val="D4D4D4"/>
+                <w:sz w:val="18"/>
+                <w:szCs w:val="18"/>
+              </w:rPr>
+              <w:t xml:space="preserve">SUB AX, 0005h   </w:t>
+            </w:r>
+            <w:proofErr w:type="gramStart"/>
+            <w:r>
+              <w:rPr>
+                <w:rFonts w:ascii="Courier New" w:eastAsia="Courier New" w:hAnsi="Courier New" w:cs="Courier New"/>
+                <w:color w:val="D4D4D4"/>
+                <w:sz w:val="18"/>
+                <w:szCs w:val="18"/>
+              </w:rPr>
+              <w:t xml:space="preserve">  ;</w:t>
+            </w:r>
+            <w:proofErr w:type="gramEnd"/>
+            <w:r>
+              <w:rPr>
+                <w:rFonts w:ascii="Courier New" w:eastAsia="Courier New" w:hAnsi="Courier New" w:cs="Courier New"/>
+                <w:color w:val="D4D4D4"/>
+                <w:sz w:val="18"/>
+                <w:szCs w:val="18"/>
+              </w:rPr>
+              <w:t xml:space="preserve"> AX = </w:t>
+            </w:r>
+            <w:proofErr w:type="gramStart"/>
+            <w:r>
+              <w:rPr>
+                <w:rFonts w:ascii="Courier New" w:eastAsia="Courier New" w:hAnsi="Courier New" w:cs="Courier New"/>
+                <w:color w:val="D4D4D4"/>
+                <w:sz w:val="18"/>
+                <w:szCs w:val="18"/>
+              </w:rPr>
+              <w:t>0  →</w:t>
+            </w:r>
+            <w:proofErr w:type="gramEnd"/>
+            <w:r>
+              <w:rPr>
+                <w:rFonts w:ascii="Courier New" w:eastAsia="Courier New" w:hAnsi="Courier New" w:cs="Courier New"/>
+                <w:color w:val="D4D4D4"/>
+                <w:sz w:val="18"/>
+                <w:szCs w:val="18"/>
+              </w:rPr>
+              <w:t xml:space="preserve">  ZF=1 (risultato zero!)</w:t>
+            </w:r>
+          </w:p>
+          <w:p>
+            <w:pPr>
+              <w:spacing w:before="20" w:after="20"/>
+            </w:pPr>
+          </w:p>
+          <w:p>
+            <w:pPr>
+              <w:spacing w:before="20" w:after="20"/>
+            </w:pPr>
+            <w:r>
+              <w:rPr>
+                <w:rFonts w:ascii="Courier New" w:eastAsia="Courier New" w:hAnsi="Courier New" w:cs="Courier New"/>
+                <w:color w:val="D4D4D4"/>
+                <w:sz w:val="18"/>
+                <w:szCs w:val="18"/>
+              </w:rPr>
+              <w:t>; INC e DEC – incremento e decremento di 1</w:t>
+            </w:r>
+          </w:p>
+          <w:p>
+            <w:pPr>
+              <w:spacing w:before="20" w:after="20"/>
+            </w:pPr>
+            <w:r>
+              <w:rPr>
+                <w:rFonts w:ascii="Courier New" w:eastAsia="Courier New" w:hAnsi="Courier New" w:cs="Courier New"/>
+                <w:color w:val="D4D4D4"/>
+                <w:sz w:val="18"/>
+                <w:szCs w:val="18"/>
+              </w:rPr>
+              <w:t xml:space="preserve">INC AX          </w:t>
+            </w:r>
+            <w:proofErr w:type="gramStart"/>
+            <w:r>
+              <w:rPr>
+                <w:rFonts w:ascii="Courier New" w:eastAsia="Courier New" w:hAnsi="Courier New" w:cs="Courier New"/>
+                <w:color w:val="D4D4D4"/>
+                <w:sz w:val="18"/>
+                <w:szCs w:val="18"/>
+              </w:rPr>
+              <w:t xml:space="preserve">  ;</w:t>
+            </w:r>
+            <w:proofErr w:type="gramEnd"/>
+            <w:r>
+              <w:rPr>
+                <w:rFonts w:ascii="Courier New" w:eastAsia="Courier New" w:hAnsi="Courier New" w:cs="Courier New"/>
+                <w:color w:val="D4D4D4"/>
+                <w:sz w:val="18"/>
+                <w:szCs w:val="18"/>
+              </w:rPr>
+              <w:t xml:space="preserve"> AX = AX + 1</w:t>
+            </w:r>
+          </w:p>
+          <w:p>
+            <w:pPr>
+              <w:spacing w:before="20" w:after="20"/>
+            </w:pPr>
+            <w:r>
+              <w:rPr>
+                <w:rFonts w:ascii="Courier New" w:eastAsia="Courier New" w:hAnsi="Courier New" w:cs="Courier New"/>
+                <w:color w:val="D4D4D4"/>
+                <w:sz w:val="18"/>
+                <w:szCs w:val="18"/>
+              </w:rPr>
+              <w:t xml:space="preserve">DEC BX          </w:t>
+            </w:r>
+            <w:proofErr w:type="gramStart"/>
+            <w:r>
+              <w:rPr>
+                <w:rFonts w:ascii="Courier New" w:eastAsia="Courier New" w:hAnsi="Courier New" w:cs="Courier New"/>
+                <w:color w:val="D4D4D4"/>
+                <w:sz w:val="18"/>
+                <w:szCs w:val="18"/>
+              </w:rPr>
+              <w:t xml:space="preserve">  ;</w:t>
+            </w:r>
+            <w:proofErr w:type="gramEnd"/>
+            <w:r>
+              <w:rPr>
+                <w:rFonts w:ascii="Courier New" w:eastAsia="Courier New" w:hAnsi="Courier New" w:cs="Courier New"/>
+                <w:color w:val="D4D4D4"/>
+                <w:sz w:val="18"/>
+                <w:szCs w:val="18"/>
+              </w:rPr>
+              <w:t xml:space="preserve"> BX = BX - 1</w:t>
+            </w:r>
+          </w:p>
+          <w:p>
+            <w:pPr>
+              <w:spacing w:before="20" w:after="20"/>
+            </w:pPr>
+          </w:p>
+          <w:p>
+            <w:pPr>
+              <w:spacing w:before="20" w:after="20"/>
+            </w:pPr>
+            <w:r>
+              <w:rPr>
+                <w:rFonts w:ascii="Courier New" w:eastAsia="Courier New" w:hAnsi="Courier New" w:cs="Courier New"/>
+                <w:color w:val="D4D4D4"/>
+                <w:sz w:val="18"/>
+                <w:szCs w:val="18"/>
+              </w:rPr>
+              <w:t>; MUL – moltiplicazione senza segno (8 bit)</w:t>
+            </w:r>
+          </w:p>
+          <w:p>
+            <w:pPr>
+              <w:spacing w:before="20" w:after="20"/>
+            </w:pPr>
+            <w:r>
+              <w:rPr>
+                <w:rFonts w:ascii="Courier New" w:eastAsia="Courier New" w:hAnsi="Courier New" w:cs="Courier New"/>
+                <w:color w:val="D4D4D4"/>
+                <w:sz w:val="18"/>
+                <w:szCs w:val="18"/>
+              </w:rPr>
+              <w:t xml:space="preserve">MOV AL, 06h     </w:t>
+            </w:r>
+            <w:proofErr w:type="gramStart"/>
+            <w:r>
+              <w:rPr>
+                <w:rFonts w:ascii="Courier New" w:eastAsia="Courier New" w:hAnsi="Courier New" w:cs="Courier New"/>
+                <w:color w:val="D4D4D4"/>
+                <w:sz w:val="18"/>
+                <w:szCs w:val="18"/>
+              </w:rPr>
+              <w:t xml:space="preserve">  ;</w:t>
+            </w:r>
+            <w:proofErr w:type="gramEnd"/>
+            <w:r>
+              <w:rPr>
+                <w:rFonts w:ascii="Courier New" w:eastAsia="Courier New" w:hAnsi="Courier New" w:cs="Courier New"/>
+                <w:color w:val="D4D4D4"/>
+                <w:sz w:val="18"/>
+                <w:szCs w:val="18"/>
+              </w:rPr>
+              <w:t xml:space="preserve"> AL = 6</w:t>
+            </w:r>
+          </w:p>
+          <w:p>
+            <w:pPr>
+              <w:spacing w:before="20" w:after="20"/>
+            </w:pPr>
+            <w:r>
+              <w:rPr>
+                <w:rFonts w:ascii="Courier New" w:eastAsia="Courier New" w:hAnsi="Courier New" w:cs="Courier New"/>
+                <w:color w:val="D4D4D4"/>
+                <w:sz w:val="18"/>
+                <w:szCs w:val="18"/>
+              </w:rPr>
+              <w:t xml:space="preserve">MOV BL, 07h     </w:t>
+            </w:r>
+            <w:proofErr w:type="gramStart"/>
+            <w:r>
+              <w:rPr>
+                <w:rFonts w:ascii="Courier New" w:eastAsia="Courier New" w:hAnsi="Courier New" w:cs="Courier New"/>
+                <w:color w:val="D4D4D4"/>
+                <w:sz w:val="18"/>
+                <w:szCs w:val="18"/>
+              </w:rPr>
+              <w:t xml:space="preserve">  ;</w:t>
+            </w:r>
+            <w:proofErr w:type="gramEnd"/>
+            <w:r>
+              <w:rPr>
+                <w:rFonts w:ascii="Courier New" w:eastAsia="Courier New" w:hAnsi="Courier New" w:cs="Courier New"/>
+                <w:color w:val="D4D4D4"/>
+                <w:sz w:val="18"/>
+                <w:szCs w:val="18"/>
+              </w:rPr>
+              <w:t xml:space="preserve"> BL = 7</w:t>
+            </w:r>
+          </w:p>
+          <w:p>
+            <w:pPr>
+              <w:spacing w:before="20" w:after="20"/>
+            </w:pPr>
+            <w:r>
+              <w:rPr>
+                <w:rFonts w:ascii="Courier New" w:eastAsia="Courier New" w:hAnsi="Courier New" w:cs="Courier New"/>
+                <w:color w:val="D4D4D4"/>
+                <w:sz w:val="18"/>
+                <w:szCs w:val="18"/>
+              </w:rPr>
+              <w:t xml:space="preserve">MUL BL          </w:t>
+            </w:r>
+            <w:proofErr w:type="gramStart"/>
+            <w:r>
+              <w:rPr>
+                <w:rFonts w:ascii="Courier New" w:eastAsia="Courier New" w:hAnsi="Courier New" w:cs="Courier New"/>
+                <w:color w:val="D4D4D4"/>
+                <w:sz w:val="18"/>
+                <w:szCs w:val="18"/>
+              </w:rPr>
+              <w:t xml:space="preserve">  ;</w:t>
+            </w:r>
+            <w:proofErr w:type="gramEnd"/>
+            <w:r>
+              <w:rPr>
+                <w:rFonts w:ascii="Courier New" w:eastAsia="Courier New" w:hAnsi="Courier New" w:cs="Courier New"/>
+                <w:color w:val="D4D4D4"/>
+                <w:sz w:val="18"/>
+                <w:szCs w:val="18"/>
+              </w:rPr>
+              <w:t xml:space="preserve"> AX = AL × BL = 42 = 002Ah</w:t>
+            </w:r>
+          </w:p>
+          <w:p>
+            <w:pPr>
+              <w:spacing w:before="20" w:after="20"/>
+            </w:pPr>
+          </w:p>
+          <w:p>
+            <w:pPr>
+              <w:spacing w:before="20" w:after="20"/>
+            </w:pPr>
+            <w:r>
+              <w:rPr>
+                <w:rFonts w:ascii="Courier New" w:eastAsia="Courier New" w:hAnsi="Courier New" w:cs="Courier New"/>
+                <w:color w:val="D4D4D4"/>
+                <w:sz w:val="18"/>
+                <w:szCs w:val="18"/>
+              </w:rPr>
+              <w:t>; DIV – divisione senza segno (16/8 bit)</w:t>
+            </w:r>
+          </w:p>
+          <w:p>
+            <w:pPr>
+              <w:spacing w:before="20" w:after="20"/>
               <w:rPr>
                 <w:lang w:val="en-GB"/>
               </w:rPr>
@@ -7418,13 +7859,12 @@
                 <w:szCs w:val="18"/>
                 <w:lang w:val="en-GB"/>
               </w:rPr>
-              <w:t>MOV AX, 0005h     ; AX = 5</w:t>
-            </w:r>
-          </w:p>
-          <w:p>
-            <w:pPr>
-              <w:spacing w:before="20" w:after="20"/>
-              <w:ind w:left="708" w:hanging="708"/>
+              <w:t>MOV AX, 001Eh     ; AX = 30</w:t>
+            </w:r>
+          </w:p>
+          <w:p>
+            <w:pPr>
+              <w:spacing w:before="20" w:after="20"/>
               <w:rPr>
                 <w:lang w:val="en-GB"/>
               </w:rPr>
@@ -7437,17 +7877,21 @@
                 <w:szCs w:val="18"/>
                 <w:lang w:val="en-GB"/>
               </w:rPr>
-              <w:t>MOV BX, 0003h     ; BX = 3</w:t>
-            </w:r>
-          </w:p>
-          <w:p>
-            <w:pPr>
-              <w:spacing w:before="20" w:after="20"/>
-              <w:ind w:left="708" w:hanging="708"/>
-              <w:rPr>
+              <w:lastRenderedPageBreak/>
+              <w:t xml:space="preserve">MOV BL, 05h     </w:t>
+            </w:r>
+            <w:proofErr w:type="gramStart"/>
+            <w:r>
+              <w:rPr>
+                <w:rFonts w:ascii="Courier New" w:eastAsia="Courier New" w:hAnsi="Courier New" w:cs="Courier New"/>
+                <w:color w:val="D4D4D4"/>
+                <w:sz w:val="18"/>
+                <w:szCs w:val="18"/>
                 <w:lang w:val="en-GB"/>
               </w:rPr>
-            </w:pPr>
+              <w:t xml:space="preserve">  ;</w:t>
+            </w:r>
+            <w:proofErr w:type="gramEnd"/>
             <w:r>
               <w:rPr>
                 <w:rFonts w:ascii="Courier New" w:eastAsia="Courier New" w:hAnsi="Courier New" w:cs="Courier New"/>
@@ -7456,357 +7900,7 @@
                 <w:szCs w:val="18"/>
                 <w:lang w:val="en-GB"/>
               </w:rPr>
-              <w:t>ADD AX, BX        ; AX = AX + BX = 8  →  ZF=0, CF=0, SF=0</w:t>
-            </w:r>
-          </w:p>
-          <w:p>
-            <w:pPr>
-              <w:spacing w:before="20" w:after="20"/>
-              <w:rPr>
-                <w:lang w:val="en-GB"/>
-              </w:rPr>
-            </w:pPr>
-          </w:p>
-          <w:p>
-            <w:pPr>
-              <w:spacing w:before="20" w:after="20"/>
-            </w:pPr>
-            <w:r>
-              <w:rPr>
-                <w:rFonts w:ascii="Courier New" w:eastAsia="Courier New" w:hAnsi="Courier New" w:cs="Courier New"/>
-                <w:color w:val="D4D4D4"/>
-                <w:sz w:val="18"/>
-                <w:szCs w:val="18"/>
-              </w:rPr>
-              <w:t>; SUB – sottrazione</w:t>
-            </w:r>
-          </w:p>
-          <w:p>
-            <w:pPr>
-              <w:spacing w:before="20" w:after="20"/>
-            </w:pPr>
-            <w:r>
-              <w:rPr>
-                <w:rFonts w:ascii="Courier New" w:eastAsia="Courier New" w:hAnsi="Courier New" w:cs="Courier New"/>
-                <w:color w:val="D4D4D4"/>
-                <w:sz w:val="18"/>
-                <w:szCs w:val="18"/>
-              </w:rPr>
-              <w:t>MOV AX, 0005h</w:t>
-            </w:r>
-          </w:p>
-          <w:p>
-            <w:pPr>
-              <w:spacing w:before="20" w:after="20"/>
-            </w:pPr>
-            <w:r>
-              <w:rPr>
-                <w:rFonts w:ascii="Courier New" w:eastAsia="Courier New" w:hAnsi="Courier New" w:cs="Courier New"/>
-                <w:color w:val="D4D4D4"/>
-                <w:sz w:val="18"/>
-                <w:szCs w:val="18"/>
-              </w:rPr>
-              <w:t xml:space="preserve">SUB AX, 0005h   </w:t>
-            </w:r>
-            <w:proofErr w:type="gramStart"/>
-            <w:r>
-              <w:rPr>
-                <w:rFonts w:ascii="Courier New" w:eastAsia="Courier New" w:hAnsi="Courier New" w:cs="Courier New"/>
-                <w:color w:val="D4D4D4"/>
-                <w:sz w:val="18"/>
-                <w:szCs w:val="18"/>
-              </w:rPr>
-              <w:t xml:space="preserve">  ;</w:t>
-            </w:r>
-            <w:proofErr w:type="gramEnd"/>
-            <w:r>
-              <w:rPr>
-                <w:rFonts w:ascii="Courier New" w:eastAsia="Courier New" w:hAnsi="Courier New" w:cs="Courier New"/>
-                <w:color w:val="D4D4D4"/>
-                <w:sz w:val="18"/>
-                <w:szCs w:val="18"/>
-              </w:rPr>
-              <w:t xml:space="preserve"> AX = </w:t>
-            </w:r>
-            <w:proofErr w:type="gramStart"/>
-            <w:r>
-              <w:rPr>
-                <w:rFonts w:ascii="Courier New" w:eastAsia="Courier New" w:hAnsi="Courier New" w:cs="Courier New"/>
-                <w:color w:val="D4D4D4"/>
-                <w:sz w:val="18"/>
-                <w:szCs w:val="18"/>
-              </w:rPr>
-              <w:t>0  →</w:t>
-            </w:r>
-            <w:proofErr w:type="gramEnd"/>
-            <w:r>
-              <w:rPr>
-                <w:rFonts w:ascii="Courier New" w:eastAsia="Courier New" w:hAnsi="Courier New" w:cs="Courier New"/>
-                <w:color w:val="D4D4D4"/>
-                <w:sz w:val="18"/>
-                <w:szCs w:val="18"/>
-              </w:rPr>
-              <w:t xml:space="preserve">  ZF=1 (risultato zero!)</w:t>
-            </w:r>
-          </w:p>
-          <w:p>
-            <w:pPr>
-              <w:spacing w:before="20" w:after="20"/>
-            </w:pPr>
-          </w:p>
-          <w:p>
-            <w:pPr>
-              <w:spacing w:before="20" w:after="20"/>
-            </w:pPr>
-            <w:r>
-              <w:rPr>
-                <w:rFonts w:ascii="Courier New" w:eastAsia="Courier New" w:hAnsi="Courier New" w:cs="Courier New"/>
-                <w:color w:val="D4D4D4"/>
-                <w:sz w:val="18"/>
-                <w:szCs w:val="18"/>
-              </w:rPr>
-              <w:t>; INC e DEC – incremento e decremento di 1</w:t>
-            </w:r>
-          </w:p>
-          <w:p>
-            <w:pPr>
-              <w:spacing w:before="20" w:after="20"/>
-            </w:pPr>
-            <w:r>
-              <w:rPr>
-                <w:rFonts w:ascii="Courier New" w:eastAsia="Courier New" w:hAnsi="Courier New" w:cs="Courier New"/>
-                <w:color w:val="D4D4D4"/>
-                <w:sz w:val="18"/>
-                <w:szCs w:val="18"/>
-              </w:rPr>
-              <w:t xml:space="preserve">INC AX          </w:t>
-            </w:r>
-            <w:proofErr w:type="gramStart"/>
-            <w:r>
-              <w:rPr>
-                <w:rFonts w:ascii="Courier New" w:eastAsia="Courier New" w:hAnsi="Courier New" w:cs="Courier New"/>
-                <w:color w:val="D4D4D4"/>
-                <w:sz w:val="18"/>
-                <w:szCs w:val="18"/>
-              </w:rPr>
-              <w:t xml:space="preserve">  ;</w:t>
-            </w:r>
-            <w:proofErr w:type="gramEnd"/>
-            <w:r>
-              <w:rPr>
-                <w:rFonts w:ascii="Courier New" w:eastAsia="Courier New" w:hAnsi="Courier New" w:cs="Courier New"/>
-                <w:color w:val="D4D4D4"/>
-                <w:sz w:val="18"/>
-                <w:szCs w:val="18"/>
-              </w:rPr>
-              <w:t xml:space="preserve"> AX = AX + 1</w:t>
-            </w:r>
-          </w:p>
-          <w:p>
-            <w:pPr>
-              <w:spacing w:before="20" w:after="20"/>
-            </w:pPr>
-            <w:r>
-              <w:rPr>
-                <w:rFonts w:ascii="Courier New" w:eastAsia="Courier New" w:hAnsi="Courier New" w:cs="Courier New"/>
-                <w:color w:val="D4D4D4"/>
-                <w:sz w:val="18"/>
-                <w:szCs w:val="18"/>
-              </w:rPr>
-              <w:t xml:space="preserve">DEC BX          </w:t>
-            </w:r>
-            <w:proofErr w:type="gramStart"/>
-            <w:r>
-              <w:rPr>
-                <w:rFonts w:ascii="Courier New" w:eastAsia="Courier New" w:hAnsi="Courier New" w:cs="Courier New"/>
-                <w:color w:val="D4D4D4"/>
-                <w:sz w:val="18"/>
-                <w:szCs w:val="18"/>
-              </w:rPr>
-              <w:t xml:space="preserve">  ;</w:t>
-            </w:r>
-            <w:proofErr w:type="gramEnd"/>
-            <w:r>
-              <w:rPr>
-                <w:rFonts w:ascii="Courier New" w:eastAsia="Courier New" w:hAnsi="Courier New" w:cs="Courier New"/>
-                <w:color w:val="D4D4D4"/>
-                <w:sz w:val="18"/>
-                <w:szCs w:val="18"/>
-              </w:rPr>
-              <w:t xml:space="preserve"> BX = BX - 1</w:t>
-            </w:r>
-          </w:p>
-          <w:p>
-            <w:pPr>
-              <w:spacing w:before="20" w:after="20"/>
-            </w:pPr>
-          </w:p>
-          <w:p>
-            <w:pPr>
-              <w:spacing w:before="20" w:after="20"/>
-            </w:pPr>
-            <w:r>
-              <w:rPr>
-                <w:rFonts w:ascii="Courier New" w:eastAsia="Courier New" w:hAnsi="Courier New" w:cs="Courier New"/>
-                <w:color w:val="D4D4D4"/>
-                <w:sz w:val="18"/>
-                <w:szCs w:val="18"/>
-              </w:rPr>
-              <w:t>; MUL – moltiplicazione senza segno (8 bit)</w:t>
-            </w:r>
-          </w:p>
-          <w:p>
-            <w:pPr>
-              <w:spacing w:before="20" w:after="20"/>
-            </w:pPr>
-            <w:r>
-              <w:rPr>
-                <w:rFonts w:ascii="Courier New" w:eastAsia="Courier New" w:hAnsi="Courier New" w:cs="Courier New"/>
-                <w:color w:val="D4D4D4"/>
-                <w:sz w:val="18"/>
-                <w:szCs w:val="18"/>
-              </w:rPr>
-              <w:t xml:space="preserve">MOV AL, 06h     </w:t>
-            </w:r>
-            <w:proofErr w:type="gramStart"/>
-            <w:r>
-              <w:rPr>
-                <w:rFonts w:ascii="Courier New" w:eastAsia="Courier New" w:hAnsi="Courier New" w:cs="Courier New"/>
-                <w:color w:val="D4D4D4"/>
-                <w:sz w:val="18"/>
-                <w:szCs w:val="18"/>
-              </w:rPr>
-              <w:t xml:space="preserve">  ;</w:t>
-            </w:r>
-            <w:proofErr w:type="gramEnd"/>
-            <w:r>
-              <w:rPr>
-                <w:rFonts w:ascii="Courier New" w:eastAsia="Courier New" w:hAnsi="Courier New" w:cs="Courier New"/>
-                <w:color w:val="D4D4D4"/>
-                <w:sz w:val="18"/>
-                <w:szCs w:val="18"/>
-              </w:rPr>
-              <w:t xml:space="preserve"> AL = 6</w:t>
-            </w:r>
-          </w:p>
-          <w:p>
-            <w:pPr>
-              <w:spacing w:before="20" w:after="20"/>
-            </w:pPr>
-            <w:r>
-              <w:rPr>
-                <w:rFonts w:ascii="Courier New" w:eastAsia="Courier New" w:hAnsi="Courier New" w:cs="Courier New"/>
-                <w:color w:val="D4D4D4"/>
-                <w:sz w:val="18"/>
-                <w:szCs w:val="18"/>
-              </w:rPr>
-              <w:t xml:space="preserve">MOV BL, 07h     </w:t>
-            </w:r>
-            <w:proofErr w:type="gramStart"/>
-            <w:r>
-              <w:rPr>
-                <w:rFonts w:ascii="Courier New" w:eastAsia="Courier New" w:hAnsi="Courier New" w:cs="Courier New"/>
-                <w:color w:val="D4D4D4"/>
-                <w:sz w:val="18"/>
-                <w:szCs w:val="18"/>
-              </w:rPr>
-              <w:t xml:space="preserve">  ;</w:t>
-            </w:r>
-            <w:proofErr w:type="gramEnd"/>
-            <w:r>
-              <w:rPr>
-                <w:rFonts w:ascii="Courier New" w:eastAsia="Courier New" w:hAnsi="Courier New" w:cs="Courier New"/>
-                <w:color w:val="D4D4D4"/>
-                <w:sz w:val="18"/>
-                <w:szCs w:val="18"/>
-              </w:rPr>
-              <w:t xml:space="preserve"> BL = 7</w:t>
-            </w:r>
-          </w:p>
-          <w:p>
-            <w:pPr>
-              <w:spacing w:before="20" w:after="20"/>
-            </w:pPr>
-            <w:r>
-              <w:rPr>
-                <w:rFonts w:ascii="Courier New" w:eastAsia="Courier New" w:hAnsi="Courier New" w:cs="Courier New"/>
-                <w:color w:val="D4D4D4"/>
-                <w:sz w:val="18"/>
-                <w:szCs w:val="18"/>
-              </w:rPr>
-              <w:t xml:space="preserve">MUL BL          </w:t>
-            </w:r>
-            <w:proofErr w:type="gramStart"/>
-            <w:r>
-              <w:rPr>
-                <w:rFonts w:ascii="Courier New" w:eastAsia="Courier New" w:hAnsi="Courier New" w:cs="Courier New"/>
-                <w:color w:val="D4D4D4"/>
-                <w:sz w:val="18"/>
-                <w:szCs w:val="18"/>
-              </w:rPr>
-              <w:t xml:space="preserve">  ;</w:t>
-            </w:r>
-            <w:proofErr w:type="gramEnd"/>
-            <w:r>
-              <w:rPr>
-                <w:rFonts w:ascii="Courier New" w:eastAsia="Courier New" w:hAnsi="Courier New" w:cs="Courier New"/>
-                <w:color w:val="D4D4D4"/>
-                <w:sz w:val="18"/>
-                <w:szCs w:val="18"/>
-              </w:rPr>
-              <w:t xml:space="preserve"> AX = AL × BL = 42 = 002Ah</w:t>
-            </w:r>
-          </w:p>
-          <w:p>
-            <w:pPr>
-              <w:spacing w:before="20" w:after="20"/>
-            </w:pPr>
-          </w:p>
-          <w:p>
-            <w:pPr>
-              <w:spacing w:before="20" w:after="20"/>
-            </w:pPr>
-            <w:r>
-              <w:rPr>
-                <w:rFonts w:ascii="Courier New" w:eastAsia="Courier New" w:hAnsi="Courier New" w:cs="Courier New"/>
-                <w:color w:val="D4D4D4"/>
-                <w:sz w:val="18"/>
-                <w:szCs w:val="18"/>
-              </w:rPr>
-              <w:t>; DIV – divisione senza segno (16/8 bit)</w:t>
-            </w:r>
-          </w:p>
-          <w:p>
-            <w:pPr>
-              <w:spacing w:before="20" w:after="20"/>
-              <w:rPr>
-                <w:lang w:val="en-GB"/>
-              </w:rPr>
-            </w:pPr>
-            <w:r>
-              <w:rPr>
-                <w:rFonts w:ascii="Courier New" w:eastAsia="Courier New" w:hAnsi="Courier New" w:cs="Courier New"/>
-                <w:color w:val="D4D4D4"/>
-                <w:sz w:val="18"/>
-                <w:szCs w:val="18"/>
-                <w:lang w:val="en-GB"/>
-              </w:rPr>
-              <w:t>MOV AX, 001Eh     ; AX = 30</w:t>
-            </w:r>
-          </w:p>
-          <w:p>
-            <w:pPr>
-              <w:spacing w:before="20" w:after="20"/>
-            </w:pPr>
-            <w:r>
-              <w:rPr>
-                <w:rFonts w:ascii="Courier New" w:eastAsia="Courier New" w:hAnsi="Courier New" w:cs="Courier New"/>
-                <w:color w:val="D4D4D4"/>
-                <w:sz w:val="18"/>
-                <w:szCs w:val="18"/>
-              </w:rPr>
-              <w:lastRenderedPageBreak/>
-              <w:t>MOV BL, 05h       ; BL = 5</w:t>
+              <w:t xml:space="preserve"> BL = 5</w:t>
             </w:r>
           </w:p>
           <w:p>

</xml_diff>